<commit_message>
BPP: anonymise title-page repository URL and update data availability wording
Co-Authored-By: Tatsuki Onishi <bougtoir@gmail.com>
</commit_message>
<xml_diff>
--- a/medical_accident_its_analysis/manuscript/bpp_title_page.docx
+++ b/medical_accident_its_analysis/manuscript/bpp_title_page.docx
@@ -77,7 +77,7 @@
           <w:rFonts w:ascii="Times New Roman" w:hAnsi="Times New Roman"/>
           <w:sz w:val="24"/>
         </w:rPr>
-        <w:t>Word count: approximately 6811 words in total, including abstract and references; main text excluding abstract and references is approximately 5463 words</w:t>
+        <w:t>Word count: approximately 6812 words in total, including abstract and references; main text excluding abstract and references is approximately 5463 words</w:t>
       </w:r>
     </w:p>
     <w:p>
@@ -149,7 +149,7 @@
           <w:rFonts w:ascii="Times New Roman" w:hAnsi="Times New Roman"/>
           <w:sz w:val="24"/>
         </w:rPr>
-        <w:t>Data availability: all primary data and analysis code are openly available in the project repository (https://github.com/bougtoir/medical-accident-its-analysis).</w:t>
+        <w:t>Data availability: all primary data and analysis code are openly available in the project repository ([repository URL to be inserted on acceptance]).</w:t>
       </w:r>
     </w:p>
     <w:sectPr>

</xml_diff>